<commit_message>
feat: 半决赛预测v25 — xG/xGA/npxG新指标 + 盘口数字赔率 + CLAUDE.md铁律20-24
SF1 法国vs西班牙(7/15 03:00): 首选法国2-1(~22%), xG效率1.20x vs 0.86x为核心发现
SF2 英格兰vs阿根廷(7/16 03:00): 首选英格兰2-1(~20%), 阿根廷连续加时体能红灯

修复:
- 西班牙晋级路径: 奥地利→葡萄牙→比利时(此前误用佛得角/乌拉圭)
- 法国晋级路径: 瑞典→巴拉圭→摩洛哥(此前R32/R16顺序颠倒)
- 英格兰R32: 补充刚果民主共和国2-1(凯恩2球89'绝杀)
- 全部FRA/ESP/ENG/ARG→中文全称
- 盘口美式赔率(+135/-115)→数字格式(2.35/1.87)
- 波胆表新增加赔率+市场vs我们对比列
- 分两个独立文档(铁律22)

新规则(CLAUDE.md v25):
- 铁律20: xG/xGA/npxG纳入预测框架
- 铁律21: DOCX盘口三表齐全+数字赔率
- 铁律22: 半决赛两场分两个文档
- 铁律23: DOCX国家名禁止三字母缩写
- 铁律24: 晋级路径回顾必须查项目文件/官方数据

Co-Authored-By: Claude Opus 4.8 (1M context) <noreply@anthropic.com>
</commit_message>
<xml_diff>
--- a/2026年7月11日_西班牙vs比利时_预测.docx
+++ b/2026年7月11日_西班牙vs比利时_预测.docx
@@ -66,7 +66,7 @@
           <w:sz w:val="28"/>
           <w:szCs w:val="28"/>
         </w:rPr>
-        <w:t xml:space="preserve">欧洲内战 — 零封之王 vs 进攻回归的红魔</w:t>
+        <w:t xml:space="preserve">QF — 零封之王 vs 红魔进攻革命 (首发确认版)</w:t>
       </w:r>
     </w:p>
     <w:p>
@@ -85,7 +85,7 @@
           <w:sz w:val="22"/>
           <w:szCs w:val="22"/>
         </w:rPr>
-        <w:t xml:space="preserve">四分之一决赛 Match 98 | 西班牙#2 vs 比利时#9</w:t>
+        <w:t xml:space="preserve">四分之一决赛 Match 98 | 西班牙#2 vs 比利时#9 | 双方4-2-3-1</w:t>
       </w:r>
     </w:p>
     <w:p>
@@ -104,7 +104,7 @@
           <w:sz w:val="18"/>
           <w:szCs w:val="18"/>
         </w:rPr>
-        <w:t xml:space="preserve">北京时间 2026年7月11日 03:00 | SoFi Stadium, Inglewood, CA | 全顶棚场馆 无天气影响 | 裁判: Michael Oliver (英格兰)</w:t>
+        <w:t xml:space="preserve">北京时间 2026年7月11日 03:00 | SoFi Stadium, Inglewood, CA | 全顶棚场馆 | 裁判: Michael Oliver (英格兰)</w:t>
       </w:r>
     </w:p>
     <w:p>
@@ -123,7 +123,7 @@
           <w:sz w:val="18"/>
           <w:szCs w:val="18"/>
         </w:rPr>
-        <w:t xml:space="preserve">🆕 7/10更新 | 法国2-0摩洛哥确认SF对手 | 特罗萨德肌肉伤疑 | 数据截止赛前约13小时 | Polymarket $3.2M</w:t>
+        <w:t xml:space="preserve">🚨 7/11 02:10 BJT FIFA官方首发确认 | 西班牙: Fabián Ruiz首发(佩德里板凳) | 比利时: Doku首发RW, CDK伪9号CF, Raskin首发DM</w:t>
       </w:r>
     </w:p>
     <w:p>
@@ -142,7 +142,7 @@
           <w:sz w:val="18"/>
           <w:szCs w:val="18"/>
         </w:rPr>
-        <w:t xml:space="preserve">ESP €1.267B (#3) vs BEL €530M (#13) — 身价比 2.4:1 (&lt;3:1区间)</w:t>
+        <w:t xml:space="preserve">ESP €1.267B (#3) vs BEL €530M (#13) — 身价比 2.4:1 (&lt;3:1区间) | Polymarket赛前-8M交易量</w:t>
       </w:r>
     </w:p>
     <w:p>
@@ -653,7 +653,7 @@
                 <w:sz w:val="16"/>
                 <w:szCs w:val="16"/>
               </w:rPr>
-              <w:t xml:space="preserve">西班牙: 体系型+防守堡垒 / 比利时: 体系型(进攻回暖)</w:t>
+              <w:t xml:space="preserve">🚨双方4-2-3-1 | ESP: 超级巨星+防守堡垒 | BEL: CDK伪9号+Doku右翼爆破</w:t>
             </w:r>
           </w:p>
         </w:tc>
@@ -801,7 +801,7 @@
                 <w:sz w:val="16"/>
                 <w:szCs w:val="16"/>
               </w:rPr>
-              <w:t xml:space="preserve">中</w:t>
+              <w:t xml:space="preserve">中+</w:t>
             </w:r>
           </w:p>
         </w:tc>
@@ -823,7 +823,7 @@
           <w:sz w:val="15"/>
           <w:szCs w:val="15"/>
         </w:rPr>
-        <w:t xml:space="preserve">[注意] 🆕 法国2-0摩洛哥确认SF对手(姆巴佩60'/登贝莱66')。西班牙5场0失球(609分钟=赛事纪录)。比利时近3场12球但奥纳纳(ACL)核心缺阵+特罗萨德(肌肉)伤疑。亚马尔(€200M)vs德克伊珀(€18M)=对位断崖。库尔图瓦=西班牙零封的最大威胁。SoFi全顶棚=零天气影响。</w:t>
+        <w:t xml:space="preserve">🚨 FIFA官方首发确认: 双方4-2-3-1。ESP: Fabián Ruiz(佩德里板凳)→创造力↓防守↑。BEL: Doku首发RW→速度爆破 vs Cucurella; CDK伪9号CF; Raskin(流浪者)拦截型DM。Lukaku板凳(超级替补)。Nico+Pino进入名单。西班牙板凳(Pedri€80M+Nico€70M+Merino)碾压比利时。Polymarket -8M交易量。</w:t>
       </w:r>
     </w:p>
     <w:p>
@@ -1488,7 +1488,7 @@
           <w:sz w:val="30"/>
           <w:szCs w:val="30"/>
         </w:rPr>
-        <w:t xml:space="preserve">盘口分析 (Polymarket $3.2M + DraftKings + FanDuel — 7/9更新)</w:t>
+        <w:t xml:space="preserve">盘口分析 (🚨 赛前1h更新 | Polymarket $7-8M + BetMGM + Fox + DraftKings)</w:t>
       </w:r>
     </w:p>
     <w:p>
@@ -1507,7 +1507,7 @@
           <w:sz w:val="18"/>
           <w:szCs w:val="18"/>
         </w:rPr>
-        <w:t xml:space="preserve">赔率读法: 小数赔率=1/隐含概率(含抽水)。如1.61=投100收回161。Polymarket直接显示¢价格=概率%。总交易量$3.2M——QF级别高流动性。</w:t>
+        <w:t xml:space="preserve">赔率读法: 小数赔率=1/隐含概率(含抽水)。Polymarket直接显示¢价格=概率%。总交易量$7-8M(24h净增$4-5M)——QF最大流动性市场。价格近乎零波动→无最后时刻催化剂。</w:t>
       </w:r>
     </w:p>
     <w:p>
@@ -1526,7 +1526,7 @@
           <w:sz w:val="18"/>
           <w:szCs w:val="18"/>
         </w:rPr>
-        <w:t xml:space="preserve">[关键] 市场定价西班牙59.5%常规时间胜——和我们(55-60%)一致。Over 2.5=54%和BTTS=53%——市场认为比利时将打破西班牙0失球纪录。我们持不同观点: 西班牙零封概率~58%, BTTS~42%。</w:t>
+        <w:t xml:space="preserve">🚨 [关键发现] BTTS上一版53%数据有误——实际仅~35%! 市场远不如我们之前认为的‘倾向大球+双方进球’。西班牙零封取胜(+185)是最受追捧的投注选项之一。Over 2.5=56.5%与我们48%分歧依旧——市场仍高估进球数。半场西班牙领先60.5% vs 我们倾向半场0-0 60%——方向相反。</w:t>
       </w:r>
     </w:p>
     <w:tbl>
@@ -1768,7 +1768,7 @@
                 <w:sz w:val="16"/>
                 <w:szCs w:val="16"/>
               </w:rPr>
-              <w:t xml:space="preserve">1.61</w:t>
+              <w:t xml:space="preserve">1.59</w:t>
             </w:r>
           </w:p>
         </w:tc>
@@ -1805,7 +1805,7 @@
                 <w:sz w:val="16"/>
                 <w:szCs w:val="16"/>
               </w:rPr>
-              <w:t xml:space="preserve">~59.5%</w:t>
+              <w:t xml:space="preserve">~61%</w:t>
             </w:r>
           </w:p>
         </w:tc>
@@ -1842,7 +1842,7 @@
                 <w:sz w:val="16"/>
                 <w:szCs w:val="16"/>
               </w:rPr>
-              <w:t xml:space="preserve">Polymarket 59.5¢ | DraftKings 1.61 | 三家一致</w:t>
+              <w:t xml:space="preserve">+1.5%▲ | Polymarket 61¢ BetMGM -160 Fox -170 — 接近2/3</w:t>
             </w:r>
           </w:p>
         </w:tc>
@@ -1916,7 +1916,7 @@
                 <w:sz w:val="16"/>
                 <w:szCs w:val="16"/>
               </w:rPr>
-              <w:t xml:space="preserve">3.95</w:t>
+              <w:t xml:space="preserve">4.00</w:t>
             </w:r>
           </w:p>
         </w:tc>
@@ -1952,7 +1952,7 @@
                 <w:sz w:val="16"/>
                 <w:szCs w:val="16"/>
               </w:rPr>
-              <w:t xml:space="preserve">~24.5%</w:t>
+              <w:t xml:space="preserve">~24%</w:t>
             </w:r>
           </w:p>
         </w:tc>
@@ -1988,7 +1988,7 @@
                 <w:sz w:val="16"/>
                 <w:szCs w:val="16"/>
               </w:rPr>
-              <w:t xml:space="preserve">Polymarket 24.5¢ | 接近历史淘汰赛均值</w:t>
+              <w:t xml:space="preserve">-0.5%▼ | Polymarket 24¢ BetMGM +290 — 几乎不变</w:t>
             </w:r>
           </w:p>
         </w:tc>
@@ -2101,7 +2101,7 @@
                 <w:sz w:val="16"/>
                 <w:szCs w:val="16"/>
               </w:rPr>
-              <w:t xml:space="preserve">~17%</w:t>
+              <w:t xml:space="preserve">~16%</w:t>
             </w:r>
           </w:p>
         </w:tc>
@@ -2138,7 +2138,7 @@
                 <w:sz w:val="16"/>
                 <w:szCs w:val="16"/>
               </w:rPr>
-              <w:t xml:space="preserve">Polymarket 17¢ | 约1/6概率</w:t>
+              <w:t xml:space="preserve">-1%▼ | Polymarket 16¢ Fox +470 — 约1/6</w:t>
             </w:r>
           </w:p>
         </w:tc>
@@ -2248,7 +2248,7 @@
                 <w:sz w:val="16"/>
                 <w:szCs w:val="16"/>
               </w:rPr>
-              <w:t xml:space="preserve">74%</w:t>
+              <w:t xml:space="preserve">~76%</w:t>
             </w:r>
           </w:p>
         </w:tc>
@@ -2284,7 +2284,7 @@
                 <w:sz w:val="16"/>
                 <w:szCs w:val="16"/>
               </w:rPr>
-              <w:t xml:space="preserve">Polymarket 74¢ | Kalshi 76%→基本一致</w:t>
+              <w:t xml:space="preserve">+2%▲ | Bleacher Report -350 — 市场持续看多</w:t>
             </w:r>
           </w:p>
         </w:tc>
@@ -2360,7 +2360,7 @@
                 <w:sz w:val="16"/>
                 <w:szCs w:val="16"/>
               </w:rPr>
-              <w:t xml:space="preserve">3.60</w:t>
+              <w:t xml:space="preserve">3.85</w:t>
             </w:r>
           </w:p>
         </w:tc>
@@ -2397,7 +2397,7 @@
                 <w:sz w:val="16"/>
                 <w:szCs w:val="16"/>
               </w:rPr>
-              <w:t xml:space="preserve">26%</w:t>
+              <w:t xml:space="preserve">~24%</w:t>
             </w:r>
           </w:p>
         </w:tc>
@@ -2434,7 +2434,7 @@
                 <w:sz w:val="16"/>
                 <w:szCs w:val="16"/>
               </w:rPr>
-              <w:t xml:space="preserve">Polymarket 26¢ | 约1/4概率</w:t>
+              <w:t xml:space="preserve">-2%▼ | 约1/4概率</w:t>
             </w:r>
           </w:p>
         </w:tc>
@@ -2472,7 +2472,7 @@
                 <w:sz w:val="16"/>
                 <w:szCs w:val="16"/>
               </w:rPr>
-              <w:t xml:space="preserve">西班牙 -1.5 (让球)</w:t>
+              <w:t xml:space="preserve">Over 2.5 球</w:t>
             </w:r>
           </w:p>
         </w:tc>
@@ -2508,7 +2508,7 @@
                 <w:sz w:val="16"/>
                 <w:szCs w:val="16"/>
               </w:rPr>
-              <w:t xml:space="preserve">2.99</w:t>
+              <w:t xml:space="preserve">1.77</w:t>
             </w:r>
           </w:p>
         </w:tc>
@@ -2544,7 +2544,7 @@
                 <w:sz w:val="16"/>
                 <w:szCs w:val="16"/>
               </w:rPr>
-              <w:t xml:space="preserve">34%</w:t>
+              <w:t xml:space="preserve">~56.5%</w:t>
             </w:r>
           </w:p>
         </w:tc>
@@ -2580,7 +2580,7 @@
                 <w:sz w:val="16"/>
                 <w:szCs w:val="16"/>
               </w:rPr>
-              <w:t xml:space="preserve">Polymarket 34¢ | 市场对净胜2球信心不足</w:t>
+              <w:t xml:space="preserve">+2.5%▲ | Polymarket/BetMGM -130/Fox -131 — 市场更倾大球</w:t>
             </w:r>
           </w:p>
         </w:tc>
@@ -2619,7 +2619,7 @@
                 <w:sz w:val="16"/>
                 <w:szCs w:val="16"/>
               </w:rPr>
-              <w:t xml:space="preserve">比利时 +1.5 (受让)</w:t>
+              <w:t xml:space="preserve">Under 2.5 球</w:t>
             </w:r>
           </w:p>
         </w:tc>
@@ -2656,7 +2656,7 @@
                 <w:sz w:val="16"/>
                 <w:szCs w:val="16"/>
               </w:rPr>
-              <w:t xml:space="preserve">1.50</w:t>
+              <w:t xml:space="preserve">2.10</w:t>
             </w:r>
           </w:p>
         </w:tc>
@@ -2693,7 +2693,7 @@
                 <w:sz w:val="16"/>
                 <w:szCs w:val="16"/>
               </w:rPr>
-              <w:t xml:space="preserve">67%</w:t>
+              <w:t xml:space="preserve">~43.5%</w:t>
             </w:r>
           </w:p>
         </w:tc>
@@ -2730,7 +2730,7 @@
                 <w:sz w:val="16"/>
                 <w:szCs w:val="16"/>
               </w:rPr>
-              <w:t xml:space="preserve">Polymarket 67¢</w:t>
+              <w:t xml:space="preserve">-2.5%▼</w:t>
             </w:r>
           </w:p>
         </w:tc>
@@ -2768,7 +2768,7 @@
                 <w:sz w:val="16"/>
                 <w:szCs w:val="16"/>
               </w:rPr>
-              <w:t xml:space="preserve">Over 2.5 球</w:t>
+              <w:t xml:space="preserve">🚨 BTTS (是)</w:t>
             </w:r>
           </w:p>
         </w:tc>
@@ -2804,7 +2804,7 @@
                 <w:sz w:val="16"/>
                 <w:szCs w:val="16"/>
               </w:rPr>
-              <w:t xml:space="preserve">1.85</w:t>
+              <w:t xml:space="preserve">1.82</w:t>
             </w:r>
           </w:p>
         </w:tc>
@@ -2840,7 +2840,7 @@
                 <w:sz w:val="16"/>
                 <w:szCs w:val="16"/>
               </w:rPr>
-              <w:t xml:space="preserve">~54%</w:t>
+              <w:t xml:space="preserve">~35%</w:t>
             </w:r>
           </w:p>
         </w:tc>
@@ -2876,7 +2876,7 @@
                 <w:sz w:val="16"/>
                 <w:szCs w:val="16"/>
               </w:rPr>
-              <w:t xml:space="preserve">Polymarket 54¢ | 市场倾向大球</w:t>
+              <w:t xml:space="preserve">🔴上版53%有误! DraftKings +182 实际~35%——市场不认为比利时必破门</w:t>
             </w:r>
           </w:p>
         </w:tc>
@@ -2915,7 +2915,7 @@
                 <w:sz w:val="16"/>
                 <w:szCs w:val="16"/>
               </w:rPr>
-              <w:t xml:space="preserve">Under 2.5 球</w:t>
+              <w:t xml:space="preserve">BTTS (否)</w:t>
             </w:r>
           </w:p>
         </w:tc>
@@ -2952,7 +2952,7 @@
                 <w:sz w:val="16"/>
                 <w:szCs w:val="16"/>
               </w:rPr>
-              <w:t xml:space="preserve">2.17</w:t>
+              <w:t xml:space="preserve">1.95</w:t>
             </w:r>
           </w:p>
         </w:tc>
@@ -2989,7 +2989,7 @@
                 <w:sz w:val="16"/>
                 <w:szCs w:val="16"/>
               </w:rPr>
-              <w:t xml:space="preserve">~46%</w:t>
+              <w:t xml:space="preserve">~52%</w:t>
             </w:r>
           </w:p>
         </w:tc>
@@ -3026,7 +3026,7 @@
                 <w:sz w:val="16"/>
                 <w:szCs w:val="16"/>
               </w:rPr>
-              <w:t xml:space="preserve">Polymarket 46¢</w:t>
+              <w:t xml:space="preserve">市场倾向No——与我们47%方向一致</w:t>
             </w:r>
           </w:p>
         </w:tc>
@@ -3064,7 +3064,7 @@
                 <w:sz w:val="16"/>
                 <w:szCs w:val="16"/>
               </w:rPr>
-              <w:t xml:space="preserve">双方都进球 (是)</w:t>
+              <w:t xml:space="preserve">🆕 西班牙 Win to Nil</w:t>
             </w:r>
           </w:p>
         </w:tc>
@@ -3100,7 +3100,7 @@
                 <w:sz w:val="16"/>
                 <w:szCs w:val="16"/>
               </w:rPr>
-              <w:t xml:space="preserve">1.89</w:t>
+              <w:t xml:space="preserve">2.85</w:t>
             </w:r>
           </w:p>
         </w:tc>
@@ -3136,7 +3136,7 @@
                 <w:sz w:val="16"/>
                 <w:szCs w:val="16"/>
               </w:rPr>
-              <w:t xml:space="preserve">53%</w:t>
+              <w:t xml:space="preserve">~35%</w:t>
             </w:r>
           </w:p>
         </w:tc>
@@ -3172,7 +3172,7 @@
                 <w:sz w:val="16"/>
                 <w:szCs w:val="16"/>
               </w:rPr>
-              <w:t xml:space="preserve">Polymarket 53¢ | 市场认为比利时将破西班牙大门</w:t>
+              <w:t xml:space="preserve">BetMGM +185 — 西班牙零封取胜=高价值投注</w:t>
             </w:r>
           </w:p>
         </w:tc>
@@ -3211,7 +3211,7 @@
                 <w:sz w:val="16"/>
                 <w:szCs w:val="16"/>
               </w:rPr>
-              <w:t xml:space="preserve">双方都进球 (否)</w:t>
+              <w:t xml:space="preserve">🆕 ESP ML + Under 2.5串关</w:t>
             </w:r>
           </w:p>
         </w:tc>
@@ -3248,7 +3248,7 @@
                 <w:sz w:val="16"/>
                 <w:szCs w:val="16"/>
               </w:rPr>
-              <w:t xml:space="preserve">2.08</w:t>
+              <w:t xml:space="preserve">3.59</w:t>
             </w:r>
           </w:p>
         </w:tc>
@@ -3285,7 +3285,7 @@
                 <w:sz w:val="16"/>
                 <w:szCs w:val="16"/>
               </w:rPr>
-              <w:t xml:space="preserve">48%</w:t>
+              <w:t xml:space="preserve">~28%</w:t>
             </w:r>
           </w:p>
         </w:tc>
@@ -3322,7 +3322,7 @@
                 <w:sz w:val="16"/>
                 <w:szCs w:val="16"/>
               </w:rPr>
-              <w:t xml:space="preserve">Polymarket 48¢</w:t>
+              <w:t xml:space="preserve">+259 — 与我们1-0首选完美一致</w:t>
             </w:r>
           </w:p>
         </w:tc>
@@ -3468,7 +3468,7 @@
                 <w:sz w:val="16"/>
                 <w:szCs w:val="16"/>
               </w:rPr>
-              <w:t xml:space="preserve">Polymarket 26¢ | 约1/4概率</w:t>
+              <w:t xml:space="preserve">Polymarket 26¢ — 不变</w:t>
             </w:r>
           </w:p>
         </w:tc>
@@ -3618,7 +3618,7 @@
                 <w:sz w:val="16"/>
                 <w:szCs w:val="16"/>
               </w:rPr>
-              <w:t xml:space="preserve">Polymarket 17¢ | 约1/6概率</w:t>
+              <w:t xml:space="preserve">Polymarket 17¢ — 不变</w:t>
             </w:r>
           </w:p>
         </w:tc>
@@ -4933,7 +4933,7 @@
           <w:sz w:val="24"/>
           <w:szCs w:val="24"/>
         </w:rPr>
-        <w:t xml:space="preserve">西班牙 (4-3-3 | 右→左 | Transfermarkt身价)</w:t>
+        <w:t xml:space="preserve">🚨 西班牙 (4-2-3-1 官方确认 | 右→左 | Transfermarkt身价)</w:t>
       </w:r>
     </w:p>
     <w:p>
@@ -4952,7 +4952,7 @@
           <w:sz w:val="18"/>
           <w:szCs w:val="18"/>
         </w:rPr>
-        <w:t xml:space="preserve">[关键] 罗德里重伤赛季→评分下调至8.0(非巅峰版世界最佳后腰)。威廉姆斯(€80M/内收肌伤)→出场概率≤30%。亚马尔vs德克伊珀(€200M vs €12M)=本场最大单点差距——西班牙应集中40%攻击投入右路。</w:t>
+        <w:t xml:space="preserve">🚨 [首发确认] 德拉富恩特选择Fabián Ruiz(185cm)+Rodri双后腰→身体对抗优先&gt;控球。Pedri(€80M)板凳=世界最强替补武器之一。佩德里+Nico Williams(€70M, 进入名单)+Merino(绝杀英雄)=60-75'后可改变比赛维度。Fabián入选回应加西亚选择Raskin+Doku→双方都优先身体对抗。</w:t>
       </w:r>
     </w:p>
     <w:p>
@@ -4971,7 +4971,7 @@
           <w:sz w:val="18"/>
           <w:szCs w:val="18"/>
         </w:rPr>
-        <w:t xml:space="preserve">关键替补: 拉亚(GK)/格里马尔多(LB/€45M)/梅里诺(CM/€50M, R16绝杀)/奥尔莫(AM/€60M)/费兰·托雷斯(RW)/威廉姆斯(LW/€80M, 伤疑)/加维(CM/€90M)</w:t>
+        <w:t xml:space="preserve">关键替补: 佩德里(CM/€80M——最大板凳武器) / Nico Williams(LW/€70M, 可替补) / Merino(CM/R16绝杀) / 耶雷米·皮诺(LW——意外可用) / 费兰·托雷斯(RW) / 加维(CM) / 拉亚(GK)</w:t>
       </w:r>
     </w:p>
     <w:tbl>
@@ -5363,7 +5363,7 @@
                 <w:sz w:val="16"/>
                 <w:szCs w:val="16"/>
               </w:rPr>
-              <w:t xml:space="preserve">8.5</w:t>
+              <w:t xml:space="preserve">8.0</w:t>
             </w:r>
           </w:p>
         </w:tc>
@@ -5437,7 +5437,7 @@
                 <w:sz w:val="16"/>
                 <w:szCs w:val="16"/>
               </w:rPr>
-              <w:t xml:space="preserve">毕尔巴鄂。609分钟不失球=世界杯历史级。扑救率87%。但面对的射门质量有限</w:t>
+              <w:t xml:space="preserve">5场0失球(609分钟=赛事纪录)。面对葡萄牙仅2次射正→考验有限</w:t>
             </w:r>
           </w:p>
         </w:tc>
@@ -5511,7 +5511,7 @@
                 <w:sz w:val="16"/>
                 <w:szCs w:val="16"/>
               </w:rPr>
-              <w:t xml:space="preserve">2</w:t>
+              <w:t xml:space="preserve">12</w:t>
             </w:r>
           </w:p>
         </w:tc>
@@ -5655,7 +5655,7 @@
                 <w:sz w:val="16"/>
                 <w:szCs w:val="16"/>
               </w:rPr>
-              <w:t xml:space="preserve">热刺。R16助攻梅里诺绝杀头球。攻强守弱→多库/卢克巴基奥会针对他</w:t>
+              <w:t xml:space="preserve">热刺。R32对奥地利进球。🆕 对位Trossard(非Doku)→压力略小</w:t>
             </w:r>
           </w:p>
         </w:tc>
@@ -5731,7 +5731,7 @@
                 <w:sz w:val="16"/>
                 <w:szCs w:val="16"/>
               </w:rPr>
-              <w:t xml:space="preserve">3</w:t>
+              <w:t xml:space="preserve">14</w:t>
             </w:r>
           </w:p>
         </w:tc>
@@ -5879,7 +5879,7 @@
                 <w:sz w:val="16"/>
                 <w:szCs w:val="16"/>
               </w:rPr>
-              <w:t xml:space="preserve">经验丰富。与库巴尔西搭档默契。32岁→身价折扣</w:t>
+              <w:t xml:space="preserve">经验丰富。与库巴尔西搭档默契。32岁→身价折扣。🆕 需应对CDK伪9回撤</w:t>
             </w:r>
           </w:p>
         </w:tc>
@@ -5917,7 +5917,7 @@
                 <w:sz w:val="16"/>
                 <w:szCs w:val="16"/>
               </w:rPr>
-              <w:t xml:space="preserve"/>
+              <w:t xml:space="preserve">🚨</w:t>
             </w:r>
           </w:p>
         </w:tc>
@@ -5953,7 +5953,7 @@
                 <w:sz w:val="16"/>
                 <w:szCs w:val="16"/>
               </w:rPr>
-              <w:t xml:space="preserve">5</w:t>
+              <w:t xml:space="preserve">4</w:t>
             </w:r>
           </w:p>
         </w:tc>
@@ -5989,7 +5989,7 @@
                 <w:sz w:val="16"/>
                 <w:szCs w:val="16"/>
               </w:rPr>
-              <w:t xml:space="preserve">库巴西 (Pau Cubarsi)</w:t>
+              <w:t xml:space="preserve">库巴尔西 (Pau Cubarsi)</w:t>
             </w:r>
           </w:p>
         </w:tc>
@@ -6097,7 +6097,7 @@
                 <w:sz w:val="16"/>
                 <w:szCs w:val="16"/>
               </w:rPr>
-              <w:t xml:space="preserve">[关键] 巴萨。18岁最佳年轻CB。传球准确率91%→后场build-up核心</w:t>
+              <w:t xml:space="preserve">19岁巴萨CB。欧冠淘汰赛验证→青少年首发4项检查通过。🆕 CDK伪9考验其球商</w:t>
             </w:r>
           </w:p>
         </w:tc>
@@ -6136,7 +6136,7 @@
                 <w:sz w:val="16"/>
                 <w:szCs w:val="16"/>
               </w:rPr>
-              <w:t xml:space="preserve"/>
+              <w:t xml:space="preserve">🚨</w:t>
             </w:r>
           </w:p>
         </w:tc>
@@ -6247,7 +6247,7 @@
                 <w:sz w:val="16"/>
                 <w:szCs w:val="16"/>
               </w:rPr>
-              <w:t xml:space="preserve">7.5</w:t>
+              <w:t xml:space="preserve">8.0</w:t>
             </w:r>
           </w:p>
         </w:tc>
@@ -6321,7 +6321,7 @@
                 <w:sz w:val="16"/>
                 <w:szCs w:val="16"/>
               </w:rPr>
-              <w:t xml:space="preserve">切尔西。进攻参与度高。防守vs卢克巴基奥/德凯特拉雷→关键对位</w:t>
+              <w:t xml:space="preserve">切尔西。🆕 [关键] 对位Doku速度爆破→本场最大防守考验! 若被过→防线崩溃</w:t>
             </w:r>
           </w:p>
         </w:tc>
@@ -6431,7 +6431,7 @@
                 <w:sz w:val="16"/>
                 <w:szCs w:val="16"/>
               </w:rPr>
-              <w:t xml:space="preserve">罗德里 (Rodri) [C]</w:t>
+              <w:t xml:space="preserve">罗德里 (Rodri)</w:t>
             </w:r>
           </w:p>
         </w:tc>
@@ -6467,7 +6467,7 @@
                 <w:sz w:val="16"/>
                 <w:szCs w:val="16"/>
               </w:rPr>
-              <w:t xml:space="preserve">8.0</w:t>
+              <w:t xml:space="preserve">9.5</w:t>
             </w:r>
           </w:p>
         </w:tc>
@@ -6539,7 +6539,7 @@
                 <w:sz w:val="16"/>
                 <w:szCs w:val="16"/>
               </w:rPr>
-              <w:t xml:space="preserve">[偏差-1.0] 曼城+2024金球奖。但重伤赛季仅2184分钟→覆盖↓拦截↓。非巅峰版</w:t>
+              <w:t xml:space="preserve">金球奖得主。80次破线传球(赛事第一)。西班牙战术心脏。若伤退=体系崩溃</w:t>
             </w:r>
           </w:p>
         </w:tc>
@@ -6578,7 +6578,7 @@
                 <w:sz w:val="16"/>
                 <w:szCs w:val="16"/>
               </w:rPr>
-              <w:t xml:space="preserve"/>
+              <w:t xml:space="preserve">🚨🔄</w:t>
             </w:r>
           </w:p>
         </w:tc>
@@ -6615,7 +6615,7 @@
                 <w:sz w:val="16"/>
                 <w:szCs w:val="16"/>
               </w:rPr>
-              <w:t xml:space="preserve">20</w:t>
+              <w:t xml:space="preserve">8</w:t>
             </w:r>
           </w:p>
         </w:tc>
@@ -6652,7 +6652,7 @@
                 <w:sz w:val="16"/>
                 <w:szCs w:val="16"/>
               </w:rPr>
-              <w:t xml:space="preserve">佩德里 (Pedri)</w:t>
+              <w:t xml:space="preserve">法比安·鲁伊斯 (Fabián Ruiz)</w:t>
             </w:r>
           </w:p>
         </w:tc>
@@ -6689,7 +6689,7 @@
                 <w:sz w:val="16"/>
                 <w:szCs w:val="16"/>
               </w:rPr>
-              <w:t xml:space="preserve">8.5</w:t>
+              <w:t xml:space="preserve">8.0</w:t>
             </w:r>
           </w:p>
         </w:tc>
@@ -6726,7 +6726,7 @@
                 <w:sz w:val="16"/>
                 <w:szCs w:val="16"/>
               </w:rPr>
-              <w:t xml:space="preserve">中场</w:t>
+              <w:t xml:space="preserve">双后腰</w:t>
             </w:r>
           </w:p>
         </w:tc>
@@ -6763,7 +6763,7 @@
                 <w:sz w:val="16"/>
                 <w:szCs w:val="16"/>
               </w:rPr>
-              <w:t xml:space="preserve">[关键] 巴萨。xA 99百分位。对葡萄牙安静但传球仍是破解密集的关键</w:t>
+              <w:t xml:space="preserve">🔄 取代Pedri首发! 巴黎。185cm/身体对抗强。创造力不如Pedri→但防守覆盖↑</w:t>
             </w:r>
           </w:p>
         </w:tc>
@@ -6801,7 +6801,7 @@
                 <w:sz w:val="16"/>
                 <w:szCs w:val="16"/>
               </w:rPr>
-              <w:t xml:space="preserve"/>
+              <w:t xml:space="preserve">🚨</w:t>
             </w:r>
           </w:p>
         </w:tc>
@@ -6837,7 +6837,7 @@
                 <w:sz w:val="16"/>
                 <w:szCs w:val="16"/>
               </w:rPr>
-              <w:t xml:space="preserve">8</w:t>
+              <w:t xml:space="preserve">10</w:t>
             </w:r>
           </w:p>
         </w:tc>
@@ -6873,7 +6873,7 @@
                 <w:sz w:val="16"/>
                 <w:szCs w:val="16"/>
               </w:rPr>
-              <w:t xml:space="preserve">法比安·鲁伊斯 (Fabian Ruiz)</w:t>
+              <w:t xml:space="preserve">奥尔莫 (Olmo)</w:t>
             </w:r>
           </w:p>
         </w:tc>
@@ -6909,7 +6909,7 @@
                 <w:sz w:val="16"/>
                 <w:szCs w:val="16"/>
               </w:rPr>
-              <w:t xml:space="preserve">7.5</w:t>
+              <w:t xml:space="preserve">8.0</w:t>
             </w:r>
           </w:p>
         </w:tc>
@@ -6945,7 +6945,7 @@
                 <w:sz w:val="16"/>
                 <w:szCs w:val="16"/>
               </w:rPr>
-              <w:t xml:space="preserve">中场</w:t>
+              <w:t xml:space="preserve">前腰</w:t>
             </w:r>
           </w:p>
         </w:tc>
@@ -6981,7 +6981,7 @@
                 <w:sz w:val="16"/>
                 <w:szCs w:val="16"/>
               </w:rPr>
-              <w:t xml:space="preserve">巴黎。攻守平衡。梅里诺(绝杀英雄)可能60'后替换</w:t>
+              <w:t xml:space="preserve">莱比锡核心。Fabián+Rodri双后腰→Olmo位置更靠前→西班牙前场创造力角色</w:t>
             </w:r>
           </w:p>
         </w:tc>
@@ -7131,7 +7131,7 @@
                 <w:sz w:val="16"/>
                 <w:szCs w:val="16"/>
               </w:rPr>
-              <w:t xml:space="preserve">9.0</w:t>
+              <w:t xml:space="preserve">8.5</w:t>
             </w:r>
           </w:p>
         </w:tc>
@@ -7205,7 +7205,7 @@
                 <w:sz w:val="16"/>
                 <w:szCs w:val="16"/>
               </w:rPr>
-              <w:t xml:space="preserve">[关键] 巴萨。17次成功过人。€200M vs 德克伊珀€12M→本场最大对位差距。2年轻进球者(贝利之后)</w:t>
+              <w:t xml:space="preserve">巴萨10号。17次过人(赛事第三)。肌腱伤后1球0助→未达100%。但vs德克伊珀€18M=对位断崖仍巨</w:t>
             </w:r>
           </w:p>
         </w:tc>
@@ -7279,7 +7279,7 @@
                 <w:sz w:val="16"/>
                 <w:szCs w:val="16"/>
               </w:rPr>
-              <w:t xml:space="preserve">21</w:t>
+              <w:t xml:space="preserve">15</w:t>
             </w:r>
           </w:p>
         </w:tc>
@@ -7315,7 +7315,7 @@
                 <w:sz w:val="16"/>
                 <w:szCs w:val="16"/>
               </w:rPr>
-              <w:t xml:space="preserve">奥亚萨瓦尔 (Oyarzabal)</w:t>
+              <w:t xml:space="preserve">巴埃纳 (Baena)</w:t>
             </w:r>
           </w:p>
         </w:tc>
@@ -7351,7 +7351,7 @@
                 <w:sz w:val="16"/>
                 <w:szCs w:val="16"/>
               </w:rPr>
-              <w:t xml:space="preserve">8.5</w:t>
+              <w:t xml:space="preserve">7.5</w:t>
             </w:r>
           </w:p>
         </w:tc>
@@ -7387,7 +7387,7 @@
                 <w:sz w:val="16"/>
                 <w:szCs w:val="16"/>
               </w:rPr>
-              <w:t xml:space="preserve">中锋</w:t>
+              <w:t xml:space="preserve">左边锋</w:t>
             </w:r>
           </w:p>
         </w:tc>
@@ -7423,7 +7423,7 @@
                 <w:sz w:val="16"/>
                 <w:szCs w:val="16"/>
               </w:rPr>
-              <w:t xml:space="preserve">[关键] 皇家社会。3球(西班牙最佳射手)。17球/17场国际首发→效率惊人</w:t>
+              <w:t xml:space="preserve">比利亚雷亚尔。替代Nico Williams。对位Castagne→非决定性对位</w:t>
             </w:r>
           </w:p>
         </w:tc>
@@ -7499,7 +7499,7 @@
                 <w:sz w:val="16"/>
                 <w:szCs w:val="16"/>
               </w:rPr>
-              <w:t xml:space="preserve">10</w:t>
+              <w:t xml:space="preserve">21</w:t>
             </w:r>
           </w:p>
         </w:tc>
@@ -7536,7 +7536,7 @@
                 <w:sz w:val="16"/>
                 <w:szCs w:val="16"/>
               </w:rPr>
-              <w:t xml:space="preserve">巴埃纳 (Baena)</w:t>
+              <w:t xml:space="preserve">奥亚萨瓦尔 (Oyarzabal)</w:t>
             </w:r>
           </w:p>
         </w:tc>
@@ -7573,7 +7573,7 @@
                 <w:sz w:val="16"/>
                 <w:szCs w:val="16"/>
               </w:rPr>
-              <w:t xml:space="preserve">7.0</w:t>
+              <w:t xml:space="preserve">8.0</w:t>
             </w:r>
           </w:p>
         </w:tc>
@@ -7610,7 +7610,7 @@
                 <w:sz w:val="16"/>
                 <w:szCs w:val="16"/>
               </w:rPr>
-              <w:t xml:space="preserve">左边锋</w:t>
+              <w:t xml:space="preserve">中锋</w:t>
             </w:r>
           </w:p>
         </w:tc>
@@ -7647,7 +7647,7 @@
                 <w:sz w:val="16"/>
                 <w:szCs w:val="16"/>
               </w:rPr>
-              <w:t xml:space="preserve">[顶替] 比利亚雷亚尔。替代受伤的威廉姆斯。内切型而非爆破→左路维度下降</w:t>
+              <w:t xml:space="preserve">皇家社会。3球(赛事并列)。vs Mechele+Ngoy→有机会。17球/17场首发→效率惊人</w:t>
             </w:r>
           </w:p>
         </w:tc>
@@ -7674,7 +7674,7 @@
           <w:sz w:val="24"/>
           <w:szCs w:val="24"/>
         </w:rPr>
-        <w:t xml:space="preserve">比利时 (4-2-3-1 | 右→左 | Transfermarkt身价)</w:t>
+        <w:t xml:space="preserve">🚨 比利时 (4-2-3-1 官方确认 | 右→左 | Transfermarkt身价)</w:t>
       </w:r>
     </w:p>
     <w:p>
@@ -7693,7 +7693,7 @@
           <w:sz w:val="18"/>
           <w:szCs w:val="18"/>
         </w:rPr>
-        <w:t xml:space="preserve">[关键] 奥纳纳ACL撕裂→确认缺席(赛季报销)。瓦纳肯(33岁,R16进球)替代→防守覆盖面积↓。德布劳内大概率回归首发但34岁无球跑动能力存疑。多库体能疑虑→可能再被卢克巴基奥/特罗萨尔挤到替补。加西亚R16'无巨星阵'大实验成功→德布劳内+多库+卢卡库全部替补——若重复→西班牙赛前准备可能落空。</w:t>
+        <w:t xml:space="preserve">🚨 [首发确认——4处重大差异] ① Raskin替代Vanaken首发→加西亚选拦截&gt;组织 ② Doku首发RW→速度爆破vs Cucurella=比利时最现实进球路径 ③ CDK明确伪9号CF→回撤创造空间 ④ Lukaku+Vanaken+卢克巴基奥=豪华板凳。加西亚名言:'我有两个首发阵容——一个开场一个收尾'→70'后卢卡库入场收割。</w:t>
       </w:r>
     </w:p>
     <w:p>
@@ -7712,7 +7712,7 @@
           <w:sz w:val="18"/>
           <w:szCs w:val="18"/>
         </w:rPr>
-        <w:t xml:space="preserve">关键替补: 塞尔斯(GK)/穆尼耶(RB)/恩戈伊(CB)/瓦纳肯(CM)/曼加拉(CM)/特罗萨尔(LW/€45M)/巴卡约科(RW/€25M)/卢卡库(ST/93球——3球全部替补, '超级替补')</w:t>
+        <w:t xml:space="preserve">关键替补: 卢卡库(ST/93球——连续3场替补进球='超级替补') / 范阿肯(CM/R16进球——未首发) / 卢克巴基奥(RW——未首发) / 维特塞尔(CM/经验) / 泰特(CB) / 塞莱梅克斯(RW)</w:t>
       </w:r>
     </w:p>
     <w:tbl>
@@ -8178,7 +8178,7 @@
                 <w:sz w:val="16"/>
                 <w:szCs w:val="16"/>
               </w:rPr>
-              <w:t xml:space="preserve">[关键] 皇马。世界前三门将。高空球+扑救范围=西班牙的终极防线。32岁身价折扣不反映能力</w:t>
+              <w:t xml:space="preserve">[关键] 皇马。世界前三门将。了解西班牙每个攻击手(8年西甲)。1.99m</w:t>
             </w:r>
           </w:p>
         </w:tc>
@@ -8396,7 +8396,7 @@
                 <w:sz w:val="16"/>
                 <w:szCs w:val="16"/>
               </w:rPr>
-              <w:t xml:space="preserve">富勒姆。对位巴埃纳→相对轻松(巴埃纳内切而非爆破)</w:t>
+              <w:t xml:space="preserve">富勒姆。🆕 对位巴埃纳→可防守。若Nico替补出场→压力骤升</w:t>
             </w:r>
           </w:p>
         </w:tc>
@@ -8620,7 +8620,7 @@
                 <w:sz w:val="16"/>
                 <w:szCs w:val="16"/>
               </w:rPr>
-              <w:t xml:space="preserve">[注意] 布鲁日。已有1黄→再得牌=半决赛停赛。地面1v1 vs 奥亚萨瓦尔→劣势</w:t>
+              <w:t xml:space="preserve">[弱点] 布鲁日老将。vs Oyarzabal速度→风险。已有1黄→再得牌=半决赛停赛</w:t>
             </w:r>
           </w:p>
         </w:tc>
@@ -8694,7 +8694,7 @@
                 <w:sz w:val="16"/>
                 <w:szCs w:val="16"/>
               </w:rPr>
-              <w:t xml:space="preserve">3</w:t>
+              <w:t xml:space="preserve">25</w:t>
             </w:r>
           </w:p>
         </w:tc>
@@ -8730,7 +8730,7 @@
                 <w:sz w:val="16"/>
                 <w:szCs w:val="16"/>
               </w:rPr>
-              <w:t xml:space="preserve">泰特 (Theate)</w:t>
+              <w:t xml:space="preserve">恩戈伊 (Ngoy)</w:t>
             </w:r>
           </w:p>
         </w:tc>
@@ -8766,7 +8766,7 @@
                 <w:sz w:val="16"/>
                 <w:szCs w:val="16"/>
               </w:rPr>
-              <w:t xml:space="preserve">7.0</w:t>
+              <w:t xml:space="preserve">6.5</w:t>
             </w:r>
           </w:p>
         </w:tc>
@@ -8838,7 +8838,7 @@
                 <w:sz w:val="16"/>
                 <w:szCs w:val="16"/>
               </w:rPr>
-              <w:t xml:space="preserve">🆕 法兰克福。速度优于恩戈伊但因亚马尔拉边→中路留空间</w:t>
+              <w:t xml:space="preserve">🆕 #25(非#16)。年轻中卫。世界杯首次稳定首发。经验不足</w:t>
             </w:r>
           </w:p>
         </w:tc>
@@ -8877,7 +8877,7 @@
                 <w:sz w:val="16"/>
                 <w:szCs w:val="16"/>
               </w:rPr>
-              <w:t xml:space="preserve"/>
+              <w:t xml:space="preserve">🚨</w:t>
             </w:r>
           </w:p>
         </w:tc>
@@ -8914,7 +8914,7 @@
                 <w:sz w:val="16"/>
                 <w:szCs w:val="16"/>
               </w:rPr>
-              <w:t xml:space="preserve">3</w:t>
+              <w:t xml:space="preserve">5</w:t>
             </w:r>
           </w:p>
         </w:tc>
@@ -8988,7 +8988,7 @@
                 <w:sz w:val="16"/>
                 <w:szCs w:val="16"/>
               </w:rPr>
-              <w:t xml:space="preserve">6.5</w:t>
+              <w:t xml:space="preserve">7.0</w:t>
             </w:r>
           </w:p>
         </w:tc>
@@ -9062,7 +9062,7 @@
                 <w:sz w:val="16"/>
                 <w:szCs w:val="16"/>
               </w:rPr>
-              <w:t xml:space="preserve">[注意] 布鲁日。对位亚马尔(€200M)→本场最大对位差距(€12M vs €200M)</w:t>
+              <w:t xml:space="preserve">[注意] 布莱顿新援。对位亚马尔€200M→职业生涯最大考验! €18M vs €200M=对位断崖</w:t>
             </w:r>
           </w:p>
         </w:tc>
@@ -9100,7 +9100,7 @@
                 <w:sz w:val="16"/>
                 <w:szCs w:val="16"/>
               </w:rPr>
-              <w:t xml:space="preserve"/>
+              <w:t xml:space="preserve">🔄🚨</w:t>
             </w:r>
           </w:p>
         </w:tc>
@@ -9136,7 +9136,7 @@
                 <w:sz w:val="16"/>
                 <w:szCs w:val="16"/>
               </w:rPr>
-              <w:t xml:space="preserve">6</w:t>
+              <w:t xml:space="preserve">23</w:t>
             </w:r>
           </w:p>
         </w:tc>
@@ -9208,7 +9208,7 @@
                 <w:sz w:val="16"/>
                 <w:szCs w:val="16"/>
               </w:rPr>
-              <w:t xml:space="preserve">8.0</w:t>
+              <w:t xml:space="preserve">7.5</w:t>
             </w:r>
           </w:p>
         </w:tc>
@@ -9280,7 +9280,7 @@
                 <w:sz w:val="16"/>
                 <w:szCs w:val="16"/>
               </w:rPr>
-              <w:t xml:space="preserve">[偏差+1.0] 流浪者。R16对美国的比赛改变者——高压+抢二点+7次拦截。加西亚B方案引擎</w:t>
+              <w:t xml:space="preserve">🔄 取代Vanaken首发! 流浪者拦截型DM。23岁/身体素质出色。加西亚选拦截&gt;组织——优先锁死西班牙中路</w:t>
             </w:r>
           </w:p>
         </w:tc>
@@ -9430,7 +9430,7 @@
                 <w:sz w:val="16"/>
                 <w:szCs w:val="16"/>
               </w:rPr>
-              <w:t xml:space="preserve">8.5</w:t>
+              <w:t xml:space="preserve">8.0</w:t>
             </w:r>
           </w:p>
         </w:tc>
@@ -9467,7 +9467,7 @@
                 <w:sz w:val="16"/>
                 <w:szCs w:val="16"/>
               </w:rPr>
-              <w:t xml:space="preserve">中场</w:t>
+              <w:t xml:space="preserve">双后腰</w:t>
             </w:r>
           </w:p>
         </w:tc>
@@ -9504,7 +9504,7 @@
                 <w:sz w:val="16"/>
                 <w:szCs w:val="16"/>
               </w:rPr>
-              <w:t xml:space="preserve">[偏差+1.0] 维拉队长。R32 89'绝平头球。2球。年龄(29)身价折扣但淘汰赛价值极高</w:t>
+              <w:t xml:space="preserve">维拉队长。R32加时绝杀→大心脏。🆕 从CM退到双后腰——更多防守职责</w:t>
             </w:r>
           </w:p>
         </w:tc>
@@ -9542,7 +9542,7 @@
                 <w:sz w:val="16"/>
                 <w:szCs w:val="16"/>
               </w:rPr>
-              <w:t xml:space="preserve"/>
+              <w:t xml:space="preserve">🔄🚨</w:t>
             </w:r>
           </w:p>
         </w:tc>
@@ -9614,7 +9614,7 @@
                 <w:sz w:val="16"/>
                 <w:szCs w:val="16"/>
               </w:rPr>
-              <w:t xml:space="preserve">卢克巴基奥 (Lukebakio)</w:t>
+              <w:t xml:space="preserve">多库 (Doku)</w:t>
             </w:r>
           </w:p>
         </w:tc>
@@ -9650,7 +9650,7 @@
                 <w:sz w:val="16"/>
                 <w:szCs w:val="16"/>
               </w:rPr>
-              <w:t xml:space="preserve">7.5</w:t>
+              <w:t xml:space="preserve">8.0</w:t>
             </w:r>
           </w:p>
         </w:tc>
@@ -9722,7 +9722,7 @@
                 <w:sz w:val="16"/>
                 <w:szCs w:val="16"/>
               </w:rPr>
-              <w:t xml:space="preserve">塞维利亚。R16首发(+高压+防守贡献)→战术纪律&gt;华丽。可能更克制西班牙控球</w:t>
+              <w:t xml:space="preserve">🔄 首发RW! 曼城。速度爆破=世界级。🚨 对位Cucurella=本场最爆炸对位! 若过掉Cucurella→西班牙防线崩溃</w:t>
             </w:r>
           </w:p>
         </w:tc>
@@ -9872,7 +9872,7 @@
                 <w:sz w:val="16"/>
                 <w:szCs w:val="16"/>
               </w:rPr>
-              <w:t xml:space="preserve">8.5</w:t>
+              <w:t xml:space="preserve">9.0</w:t>
             </w:r>
           </w:p>
         </w:tc>
@@ -9946,7 +9946,7 @@
                 <w:sz w:val="16"/>
                 <w:szCs w:val="16"/>
               </w:rPr>
-              <w:t xml:space="preserve">[关键] 那不勒斯。34岁。R16对美国0分钟→大概率回归。无球跑动(对抗西班牙控球)是34岁的考验。唯一能靠传球撕裂西班牙防线的人</w:t>
+              <w:t xml:space="preserve">[关键] 确认回归——前腰位(非CM)。34岁。R16 0分钟→体力充沛。本届0球0助但创造力=比利时终极出口</w:t>
             </w:r>
           </w:p>
         </w:tc>
@@ -10020,7 +10020,7 @@
                 <w:sz w:val="16"/>
                 <w:szCs w:val="16"/>
               </w:rPr>
-              <w:t xml:space="preserve">22</w:t>
+              <w:t xml:space="preserve">10</w:t>
             </w:r>
           </w:p>
         </w:tc>
@@ -10056,7 +10056,7 @@
                 <w:sz w:val="16"/>
                 <w:szCs w:val="16"/>
               </w:rPr>
-              <w:t xml:space="preserve">多库 (Doku)</w:t>
+              <w:t xml:space="preserve">特罗萨德 (Trossard)</w:t>
             </w:r>
           </w:p>
         </w:tc>
@@ -10092,7 +10092,7 @@
                 <w:sz w:val="16"/>
                 <w:szCs w:val="16"/>
               </w:rPr>
-              <w:t xml:space="preserve">7.5</w:t>
+              <w:t xml:space="preserve">8.0</w:t>
             </w:r>
           </w:p>
         </w:tc>
@@ -10164,7 +10164,7 @@
                 <w:sz w:val="16"/>
                 <w:szCs w:val="16"/>
               </w:rPr>
-              <w:t xml:space="preserve">[可替补] 曼城。R16未首发。速度+盘带→反击武器。但体能疑虑持续→可能再被挤到替补</w:t>
+              <w:t xml:space="preserve">近3场2球2助——比利时最稳定攻击点。🆕 对位波罗(非Cucurella)→对位质量更有利</w:t>
             </w:r>
           </w:p>
         </w:tc>
@@ -10203,7 +10203,7 @@
                 <w:sz w:val="16"/>
                 <w:szCs w:val="16"/>
               </w:rPr>
-              <w:t xml:space="preserve"/>
+              <w:t xml:space="preserve">🚨🔄</w:t>
             </w:r>
           </w:p>
         </w:tc>
@@ -10314,7 +10314,7 @@
                 <w:sz w:val="16"/>
                 <w:szCs w:val="16"/>
               </w:rPr>
-              <w:t xml:space="preserve">9.0</w:t>
+              <w:t xml:space="preserve">8.5</w:t>
             </w:r>
           </w:p>
         </w:tc>
@@ -10388,7 +10388,7 @@
                 <w:sz w:val="16"/>
                 <w:szCs w:val="16"/>
               </w:rPr>
-              <w:t xml:space="preserve">[关键] 亚特兰大。R16 2球1助→赛事最佳个人表现之一。4球(比利时射手王)。伪9移动→西班牙防线从未面对过的类型</w:t>
+              <w:t xml:space="preserve">🔄 伪9号CF(非RW)! R16在该位2球1助=MOTM。回撤拉开空间→Doku/Trossard内切。但非传统支点→对CB组合考验不同</w:t>
             </w:r>
           </w:p>
         </w:tc>
@@ -10415,7 +10415,7 @@
           <w:sz w:val="30"/>
           <w:szCs w:val="30"/>
         </w:rPr>
-        <w:t xml:space="preserve">因素导向表</w:t>
+        <w:t xml:space="preserve">因素导向表 (🚨 首发确认后更新)</w:t>
       </w:r>
     </w:p>
     <w:tbl>
@@ -13784,7 +13784,7 @@
                 <w:sz w:val="16"/>
                 <w:szCs w:val="16"/>
               </w:rPr>
-              <w:t xml:space="preserve">特罗萨德 (Trossard)</w:t>
+              <w:t xml:space="preserve">德巴斯特 (Debast)</w:t>
             </w:r>
           </w:p>
         </w:tc>
@@ -13821,7 +13821,7 @@
                 <w:sz w:val="16"/>
                 <w:szCs w:val="16"/>
               </w:rPr>
-              <w:t xml:space="preserve">[伤疑] 🆕 R16肌肉伤势→需赛前体测。近3场2球2助=比利时最稳定攻击点</w:t>
+              <w:t xml:space="preserve">[可替补] 腿部伤势→尚未出场</w:t>
             </w:r>
           </w:p>
         </w:tc>
@@ -13858,7 +13858,7 @@
                 <w:sz w:val="16"/>
                 <w:szCs w:val="16"/>
               </w:rPr>
-              <w:t xml:space="preserve">★★★★</w:t>
+              <w:t xml:space="preserve">★</w:t>
             </w:r>
           </w:p>
         </w:tc>
@@ -14181,7 +14181,7 @@
           <w:sz w:val="30"/>
           <w:szCs w:val="30"/>
         </w:rPr>
-        <w:t xml:space="preserve">比分预测 — 为什么首选1-0？(10条论据)</w:t>
+        <w:t xml:space="preserve">比分预测 — 为什么首选1-0？(首发确认后9条论据)</w:t>
       </w:r>
     </w:p>
     <w:p>
@@ -14433,7 +14433,7 @@
           <w:sz w:val="30"/>
           <w:szCs w:val="30"/>
         </w:rPr>
-        <w:t xml:space="preserve">比分概率表</w:t>
+        <w:t xml:space="preserve">比分概率表 (🚨 首发确认后更新)</w:t>
       </w:r>
     </w:p>
     <w:p>
@@ -20606,7 +20606,7 @@
           <w:sz w:val="15"/>
           <w:szCs w:val="15"/>
         </w:rPr>
-        <w:t xml:space="preserve">数据源: ESPN API (event 760511) + FIFA API (match 400021538) + Polymarket + FanDuel + DraftKings + BetMGM + Kalshi + CryptoSlate + Sports Mole + FWC Times + Yahoo Sports | 裁判: Michael Oliver (英格兰) | 场地: Los Angeles Stadium (SoFi), Inglewood, CA</w:t>
+        <w:t xml:space="preserve">🚨 7/11 02:10 BJT FIFA官方首发确认 | 数据源: FIFA API + ESPN API (event 760511) + Polymarket (-8M) + DraftKings + BetMGM + Fox Sports + Goal.com + RotoWire + Sports Mole | 裁判: Michael Oliver (英格兰) | 场地: SoFi Stadium, Inglewood, CA | 半决赛对手: 法国</w:t>
       </w:r>
     </w:p>
     <w:p>
@@ -20625,7 +20625,7 @@
           <w:sz w:val="15"/>
           <w:szCs w:val="15"/>
         </w:rPr>
-        <w:t xml:space="preserve">生成时间: 2026/7/10 17:34:32 北京时间</w:t>
+        <w:t xml:space="preserve">生成时间: 2026/7/11 02:37:24 北京时间</w:t>
       </w:r>
     </w:p>
     <w:sectPr>

</xml_diff>